<commit_message>
docs(founder): this-week list — add Safari check
Co-Authored-By: Claude Sonnet 5.5 <noreply@anthropic.com>
</commit_message>
<xml_diff>
--- a/docs/founder/this-week.docx
+++ b/docs/founder/this-week.docx
@@ -760,6 +760,35 @@
           <w:szCs w:val="28"/>
         </w:rPr>
         <w:t xml:space="preserve">Quick checks (a few minutes each)</w:t>
+      </w:r>
+    </w:p>
+    <w:p>
+      <w:pPr>
+        <w:spacing w:after="80"/>
+        <w:ind w:left="360" w:hanging="360"/>
+      </w:pPr>
+      <w:r>
+        <w:rPr>
+          <w:sz w:val="24"/>
+          <w:szCs w:val="24"/>
+        </w:rPr>
+        <w:t xml:space="preserve">☐  </w:t>
+      </w:r>
+      <w:r>
+        <w:rPr>
+          <w:b/>
+          <w:bCs/>
+          <w:sz w:val="22"/>
+          <w:szCs w:val="22"/>
+        </w:rPr>
+        <w:t xml:space="preserve">Safari check (new, 11 Oct):</w:t>
+      </w:r>
+      <w:r>
+        <w:rPr>
+          <w:sz w:val="22"/>
+          <w:szCs w:val="22"/>
+        </w:rPr>
+        <w:t xml:space="preserve"> run the demo on a Mac in Safari (or ask someone with one): you should see "Click to meet" on the interviewer, and after clicking it the voice should start. I could only test this with unit tests, not real Safari.</w:t>
       </w:r>
     </w:p>
     <w:p>

</xml_diff>